<commit_message>
Update events & stats for last & current week only
</commit_message>
<xml_diff>
--- a/Edge cases.docx
+++ b/Edge cases.docx
@@ -4,6 +4,9 @@
   <w:body>
     <w:p>
       <w:r>
+        <w:rPr>
+          <w:noProof/>
+        </w:rPr>
         <w:drawing>
           <wp:inline distT="0" distB="0" distL="0" distR="0" wp14:anchorId="6E27991C" wp14:editId="0029C7FB">
             <wp:extent cx="5912485" cy="8229600"/>
@@ -49,6 +52,9 @@
     </w:p>
     <w:p>
       <w:r>
+        <w:rPr>
+          <w:noProof/>
+        </w:rPr>
         <w:lastRenderedPageBreak/>
         <w:drawing>
           <wp:inline distT="0" distB="0" distL="0" distR="0" wp14:anchorId="1E620AC6" wp14:editId="535240AB">
@@ -95,6 +101,9 @@
     </w:p>
     <w:p>
       <w:r>
+        <w:rPr>
+          <w:noProof/>
+        </w:rPr>
         <w:drawing>
           <wp:inline distT="0" distB="0" distL="0" distR="0" wp14:anchorId="12E91EB3" wp14:editId="59412DF5">
             <wp:extent cx="5943600" cy="3362960"/>
@@ -134,15 +143,7 @@
     </w:p>
     <w:p>
       <w:r>
-        <w:t xml:space="preserve">Leeds should have better credit for being the </w:t>
-      </w:r>
-      <w:proofErr w:type="gramStart"/>
-      <w:r>
-        <w:t>lowly</w:t>
-      </w:r>
-      <w:proofErr w:type="gramEnd"/>
-      <w:r>
-        <w:t xml:space="preserve"> side v mighty </w:t>
+        <w:t xml:space="preserve">Leeds should have better credit for being the lowly side v mighty </w:t>
       </w:r>
       <w:r>
         <w:t>Liverpool</w:t>
@@ -150,6 +151,9 @@
     </w:p>
     <w:p>
       <w:r>
+        <w:rPr>
+          <w:noProof/>
+        </w:rPr>
         <w:lastRenderedPageBreak/>
         <w:drawing>
           <wp:inline distT="0" distB="0" distL="0" distR="0" wp14:anchorId="7401CF86" wp14:editId="42A9FF2A">
@@ -191,16 +195,14 @@
     <w:p/>
     <w:p>
       <w:r>
-        <w:t xml:space="preserve">Sunderland gets “full” credit for own goal – uh </w:t>
+        <w:t>Sunderland gets “full” credit for own goal – uh uh</w:t>
       </w:r>
-      <w:proofErr w:type="spellStart"/>
-      <w:r>
-        <w:t>uh</w:t>
-      </w:r>
-      <w:proofErr w:type="spellEnd"/>
     </w:p>
     <w:p>
       <w:r>
+        <w:rPr>
+          <w:noProof/>
+        </w:rPr>
         <w:lastRenderedPageBreak/>
         <w:drawing>
           <wp:inline distT="0" distB="0" distL="0" distR="0" wp14:anchorId="147C1C20" wp14:editId="492E9985">
@@ -237,6 +239,147 @@
             </a:graphic>
           </wp:inline>
         </w:drawing>
+      </w:r>
+    </w:p>
+    <w:p>
+      <w:pPr>
+        <w:pStyle w:val="Heading1"/>
+      </w:pPr>
+      <w:r>
+        <w:t>After Form &amp; League Position</w:t>
+      </w:r>
+    </w:p>
+    <w:p>
+      <w:r>
+        <w:drawing>
+          <wp:inline distT="0" distB="0" distL="0" distR="0" wp14:anchorId="199679A4" wp14:editId="54B096A9">
+            <wp:extent cx="5943600" cy="3303905"/>
+            <wp:effectExtent l="0" t="0" r="0" b="0"/>
+            <wp:docPr id="1575498085" name="Picture 1"/>
+            <wp:cNvGraphicFramePr>
+              <a:graphicFrameLocks xmlns:a="http://schemas.openxmlformats.org/drawingml/2006/main" noChangeAspect="1"/>
+            </wp:cNvGraphicFramePr>
+            <a:graphic xmlns:a="http://schemas.openxmlformats.org/drawingml/2006/main">
+              <a:graphicData uri="http://schemas.openxmlformats.org/drawingml/2006/picture">
+                <pic:pic xmlns:pic="http://schemas.openxmlformats.org/drawingml/2006/picture">
+                  <pic:nvPicPr>
+                    <pic:cNvPr id="1575498085" name=""/>
+                    <pic:cNvPicPr/>
+                  </pic:nvPicPr>
+                  <pic:blipFill>
+                    <a:blip r:embed="rId9"/>
+                    <a:stretch>
+                      <a:fillRect/>
+                    </a:stretch>
+                  </pic:blipFill>
+                  <pic:spPr>
+                    <a:xfrm>
+                      <a:off x="0" y="0"/>
+                      <a:ext cx="5943600" cy="3303905"/>
+                    </a:xfrm>
+                    <a:prstGeom prst="rect">
+                      <a:avLst/>
+                    </a:prstGeom>
+                  </pic:spPr>
+                </pic:pic>
+              </a:graphicData>
+            </a:graphic>
+          </wp:inline>
+        </w:drawing>
+      </w:r>
+    </w:p>
+    <w:p>
+      <w:r>
+        <w:t>Why are Brentford ranked so low here here. overperformed eX and won away form home</w:t>
+      </w:r>
+    </w:p>
+    <w:p>
+      <w:r>
+        <w:lastRenderedPageBreak/>
+        <w:drawing>
+          <wp:inline distT="0" distB="0" distL="0" distR="0" wp14:anchorId="113476B6" wp14:editId="5A222587">
+            <wp:extent cx="5943600" cy="3536315"/>
+            <wp:effectExtent l="0" t="0" r="0" b="6985"/>
+            <wp:docPr id="793507707" name="Picture 1"/>
+            <wp:cNvGraphicFramePr>
+              <a:graphicFrameLocks xmlns:a="http://schemas.openxmlformats.org/drawingml/2006/main" noChangeAspect="1"/>
+            </wp:cNvGraphicFramePr>
+            <a:graphic xmlns:a="http://schemas.openxmlformats.org/drawingml/2006/main">
+              <a:graphicData uri="http://schemas.openxmlformats.org/drawingml/2006/picture">
+                <pic:pic xmlns:pic="http://schemas.openxmlformats.org/drawingml/2006/picture">
+                  <pic:nvPicPr>
+                    <pic:cNvPr id="793507707" name=""/>
+                    <pic:cNvPicPr/>
+                  </pic:nvPicPr>
+                  <pic:blipFill>
+                    <a:blip r:embed="rId10"/>
+                    <a:stretch>
+                      <a:fillRect/>
+                    </a:stretch>
+                  </pic:blipFill>
+                  <pic:spPr>
+                    <a:xfrm>
+                      <a:off x="0" y="0"/>
+                      <a:ext cx="5943600" cy="3536315"/>
+                    </a:xfrm>
+                    <a:prstGeom prst="rect">
+                      <a:avLst/>
+                    </a:prstGeom>
+                  </pic:spPr>
+                </pic:pic>
+              </a:graphicData>
+            </a:graphic>
+          </wp:inline>
+        </w:drawing>
+      </w:r>
+    </w:p>
+    <w:p>
+      <w:r>
+        <w:t>Why Chelsea so low here</w:t>
+      </w:r>
+    </w:p>
+    <w:p>
+      <w:r>
+        <w:drawing>
+          <wp:inline distT="0" distB="0" distL="0" distR="0" wp14:anchorId="5887AE3D" wp14:editId="6874B265">
+            <wp:extent cx="5943600" cy="3290570"/>
+            <wp:effectExtent l="0" t="0" r="0" b="5080"/>
+            <wp:docPr id="99499669" name="Picture 1"/>
+            <wp:cNvGraphicFramePr>
+              <a:graphicFrameLocks xmlns:a="http://schemas.openxmlformats.org/drawingml/2006/main" noChangeAspect="1"/>
+            </wp:cNvGraphicFramePr>
+            <a:graphic xmlns:a="http://schemas.openxmlformats.org/drawingml/2006/main">
+              <a:graphicData uri="http://schemas.openxmlformats.org/drawingml/2006/picture">
+                <pic:pic xmlns:pic="http://schemas.openxmlformats.org/drawingml/2006/picture">
+                  <pic:nvPicPr>
+                    <pic:cNvPr id="99499669" name=""/>
+                    <pic:cNvPicPr/>
+                  </pic:nvPicPr>
+                  <pic:blipFill>
+                    <a:blip r:embed="rId11"/>
+                    <a:stretch>
+                      <a:fillRect/>
+                    </a:stretch>
+                  </pic:blipFill>
+                  <pic:spPr>
+                    <a:xfrm>
+                      <a:off x="0" y="0"/>
+                      <a:ext cx="5943600" cy="3290570"/>
+                    </a:xfrm>
+                    <a:prstGeom prst="rect">
+                      <a:avLst/>
+                    </a:prstGeom>
+                  </pic:spPr>
+                </pic:pic>
+              </a:graphicData>
+            </a:graphic>
+          </wp:inline>
+        </w:drawing>
+      </w:r>
+    </w:p>
+    <w:p>
+      <w:r>
+        <w:t>Why are both teams rated so highly?</w:t>
       </w:r>
     </w:p>
     <w:sectPr>

</xml_diff>

<commit_message>
Added Season trends for Rating, mX & eX
</commit_message>
<xml_diff>
--- a/Edge cases.docx
+++ b/Edge cases.docx
@@ -380,6 +380,51 @@
     <w:p>
       <w:r>
         <w:t>Why are both teams rated so highly?</w:t>
+      </w:r>
+    </w:p>
+    <w:p>
+      <w:r>
+        <w:lastRenderedPageBreak/>
+        <w:drawing>
+          <wp:inline distT="0" distB="0" distL="0" distR="0" wp14:anchorId="5FA32F99" wp14:editId="1265F7A5">
+            <wp:extent cx="4839375" cy="1086002"/>
+            <wp:effectExtent l="0" t="0" r="0" b="0"/>
+            <wp:docPr id="128712997" name="Picture 1"/>
+            <wp:cNvGraphicFramePr>
+              <a:graphicFrameLocks xmlns:a="http://schemas.openxmlformats.org/drawingml/2006/main" noChangeAspect="1"/>
+            </wp:cNvGraphicFramePr>
+            <a:graphic xmlns:a="http://schemas.openxmlformats.org/drawingml/2006/main">
+              <a:graphicData uri="http://schemas.openxmlformats.org/drawingml/2006/picture">
+                <pic:pic xmlns:pic="http://schemas.openxmlformats.org/drawingml/2006/picture">
+                  <pic:nvPicPr>
+                    <pic:cNvPr id="128712997" name=""/>
+                    <pic:cNvPicPr/>
+                  </pic:nvPicPr>
+                  <pic:blipFill>
+                    <a:blip r:embed="rId12"/>
+                    <a:stretch>
+                      <a:fillRect/>
+                    </a:stretch>
+                  </pic:blipFill>
+                  <pic:spPr>
+                    <a:xfrm>
+                      <a:off x="0" y="0"/>
+                      <a:ext cx="4839375" cy="1086002"/>
+                    </a:xfrm>
+                    <a:prstGeom prst="rect">
+                      <a:avLst/>
+                    </a:prstGeom>
+                  </pic:spPr>
+                </pic:pic>
+              </a:graphicData>
+            </a:graphic>
+          </wp:inline>
+        </w:drawing>
+      </w:r>
+    </w:p>
+    <w:p>
+      <w:r>
+        <w:t>Penalty for missed penalty</w:t>
       </w:r>
     </w:p>
     <w:sectPr>

</xml_diff>